<commit_message>
fix: stabilise cicids pipeline and clean repo
</commit_message>
<xml_diff>
--- a/docs/thesis/thesis.docx
+++ b/docs/thesis/thesis.docx
@@ -9052,22 +9052,7 @@
         <w:t xml:space="preserve"> </w:t>
       </w:r>
       <w:r>
-        <w:t xml:space="preserve">at runtime; the configuration file’s</w:t>
-      </w:r>
-      <w:r>
-        <w:t xml:space="preserve"> </w:t>
-      </w:r>
-      <w:r>
-        <w:rPr>
-          <w:rStyle w:val="VerbatimChar"/>
-        </w:rPr>
-        <w:t xml:space="preserve">model.input_dim</w:t>
-      </w:r>
-      <w:r>
-        <w:t xml:space="preserve"> </w:t>
-      </w:r>
-      <w:r>
-        <w:t xml:space="preserve">field is treated only as an advisory value with an explicit logger warning emitted when the two disagree. This is the minimum hardening needed to make the encoder portable across datasets without silent shape-mismatch failures.</w:t>
+        <w:t xml:space="preserve">at runtime rather than being stored in YAML. This is the minimum hardening needed to make the encoder portable across datasets without silent shape-mismatch failures.</w:t>
       </w:r>
     </w:p>
     <w:bookmarkEnd w:id="62"/>
@@ -12713,7 +12698,7 @@
         <w:pStyle w:val="FirstParagraph"/>
       </w:pPr>
       <w:r>
-        <w:t xml:space="preserve">The CICIDS2017 corpus as distributed by the Canadian Institute for Cybersecurity (Sharafaldin et al., 2018) is used without any of the corrections published by Engelen et al. (2021), Rosay et al. (2022), Lanvin et al. (2023), or Liu et al. (2022). The loader in</w:t>
+        <w:t xml:space="preserve">The CICIDS2017 corpus as distributed by the Canadian Institute for Cybersecurity (Sharafaldin et al., 2018) is used without any of the label corrections published by Engelen et al. (2021), Rosay et al. (2022), Lanvin et al. (2023), or Liu et al. (2022). The loader in</w:t>
       </w:r>
       <w:r>
         <w:t xml:space="preserve"> </w:t>
@@ -12728,7 +12713,7 @@
         <w:t xml:space="preserve"> </w:t>
       </w:r>
       <w:r>
-        <w:t xml:space="preserve">reads the eight day-split archives directly from</w:t>
+        <w:t xml:space="preserve">reads the eight extracted day-split CSV files directly from</w:t>
       </w:r>
       <w:r>
         <w:t xml:space="preserve"> </w:t>
@@ -12737,7 +12722,7 @@
         <w:rPr>
           <w:rStyle w:val="VerbatimChar"/>
         </w:rPr>
-        <w:t xml:space="preserve">data/raw/lycos-ids2017/cicids2017/csv_files/</w:t>
+        <w:t xml:space="preserve">data/raw/cicids2017/</w:t>
       </w:r>
       <w:r>
         <w:t xml:space="preserve">, normalises the well-known leading-space column names (e.g. </w:t>
@@ -12764,7 +12749,22 @@
         <w:t xml:space="preserve">label</w:t>
       </w:r>
       <w:r>
-        <w:t xml:space="preserve">), canonicalises the en-dash and mojibake variants of the Web Attack label values, replaces Inf with zero, and standardises features on the benign training split. Labels are otherwise preserved exactly as distributed. The four documented error categories — malformed TCP state machines (Engelen et al., 2021), time-window label leakage (Engelen et al., 2021), duplicated flows from dual termination paths (Rosay et al., 2022), and class-level rank flips (Lanvin et al., 2023) — are therefore inherited into the training and evaluation splits. This is deliberate: the purpose of running CLAN on CICIDS2017 is to measure how much those errors shift the headline metrics, not to silently repair them.</w:t>
+        <w:t xml:space="preserve">), and canonicalises the en-dash and mojibake variants of the Web Attack label values. Because the original CICIDS2017 numeric features are raw CICFlowMeter outputs rather than the LycoSTand-cleaned values used by Lycos2017, rate/count/duration features span several additional orders of magnitude and include non-finite rate entries. The port therefore applies a parameter-free signed</w:t>
+      </w:r>
+      <w:r>
+        <w:t xml:space="preserve"> </w:t>
+      </w:r>
+      <w:r>
+        <w:rPr>
+          <w:rStyle w:val="VerbatimChar"/>
+        </w:rPr>
+        <w:t xml:space="preserve">log1p</w:t>
+      </w:r>
+      <w:r>
+        <w:t xml:space="preserve"> </w:t>
+      </w:r>
+      <w:r>
+        <w:t xml:space="preserve">magnitude transform to numeric CICIDS2017 feature columns, then imputes any remaining non-finite entries using median values fitted on the training split before applying the shared train-split standardisation step. This is a smooth scale adaptation for applying CLAN’s MLP encoder to the raw CICIDS feature distribution; labels are otherwise preserved exactly as distributed. The four documented error categories — malformed TCP state machines (Engelen et al., 2021), time-window label leakage (Engelen et al., 2021), duplicated flows from dual termination paths (Rosay et al., 2022), and class-level rank flips (Lanvin et al., 2023) — are therefore inherited into the training and evaluation splits. This is deliberate: the purpose of running CLAN on CICIDS2017 is to measure how much those errors shift the headline metrics, not to silently repair them.</w:t>
       </w:r>
     </w:p>
     <w:p>
@@ -12781,13 +12781,13 @@
         <w:rPr>
           <w:rStyle w:val="VerbatimChar"/>
         </w:rPr>
-        <w:t xml:space="preserve">Thursday-WorkingHours-Morning-WebAttacks.pcap_ISCX.zip</w:t>
-      </w:r>
-      <w:r>
-        <w:t xml:space="preserve"> </w:t>
-      </w:r>
-      <w:r>
-        <w:t xml:space="preserve">archive contains 288 602 rows whose label field is literally an empty string (neither a valid class name nor a documented placeholder). These rows are dropped by the loader with a logged warning — dropping rows with</w:t>
+        <w:t xml:space="preserve">Thursday-WorkingHours-Morning-WebAttacks.pcap_ISCX.csv</w:t>
+      </w:r>
+      <w:r>
+        <w:t xml:space="preserve"> </w:t>
+      </w:r>
+      <w:r>
+        <w:t xml:space="preserve">file contains empty label fields (neither a valid class name nor a documented placeholder). These rows are dropped by the loader with a logged warning — dropping rows with</w:t>
       </w:r>
       <w:r>
         <w:t xml:space="preserve"> </w:t>
@@ -12879,7 +12879,7 @@
         <w:t xml:space="preserve"> </w:t>
       </w:r>
       <w:r>
-        <w:t xml:space="preserve">in the CLAN reference code), (c) NaN/Inf clamping to zero, (d) stratified 50/50 train/test split with</w:t>
+        <w:t xml:space="preserve">in the CLAN reference code), (c) finite-value enforcement for model inputs via training-split imputation and final numerical sanity checks, (d) stratified 50/50 train/test split with</w:t>
       </w:r>
       <w:r>
         <w:t xml:space="preserve"> </w:t>
@@ -12903,7 +12903,7 @@
         <w:t xml:space="preserve">anomaly_detection=True</w:t>
       </w:r>
       <w:r>
-        <w:t xml:space="preserve">, and (g) training-split-only feature standardisation. The shared kernel design ensures that any difference in the Chapter 4 tables is attributable to the corpus rather than to the preprocessing.</w:t>
+        <w:t xml:space="preserve">, and (g) training-split-only feature standardisation. The only dataset-specific numeric adaptation is the CICIDS2017 signed-log magnitude transform described above; it is applied before splitting, is monotonic, and uses no labels beyond the already-public class column. The shared kernel design ensures that any difference in the Chapter 4 tables is attributable to the corpus rather than to architecture, optimiser, augmentation, or evaluation protocol.</w:t>
       </w:r>
     </w:p>
     <w:bookmarkEnd w:id="69"/>
@@ -15126,7 +15126,7 @@
         <w:t xml:space="preserve"> </w:t>
       </w:r>
       <w:r>
-        <w:t xml:space="preserve">The tables in this chapter use the evaluation protocol fixed in §3.10 and are populated after the three pretraining seeds × two datasets × ten fine-tune sample seeds complete on the NVIDIA RTX 3060 Laptop GPU training rig. Where a numeric cell reads</w:t>
+        <w:t xml:space="preserve">The tables in this chapter use the evaluation protocol fixed in §3.10. The Lycos2017 results are populated from the completed three-seed run on the NVIDIA RTX 3060 Laptop GPU training rig. Where a numeric cell reads</w:t>
       </w:r>
       <w:r>
         <w:t xml:space="preserve"> </w:t>
@@ -15139,36 +15139,65 @@
         <w:t xml:space="preserve">“TBD”</w:t>
       </w:r>
       <w:r>
-        <w:t xml:space="preserve">, the corresponding experiment is queued but not yet reported; the discussion below interprets the</w:t>
-      </w:r>
-      <w:r>
-        <w:t xml:space="preserve"> </w:t>
-      </w:r>
-      <w:r>
-        <w:rPr>
-          <w:i/>
-          <w:iCs/>
-        </w:rPr>
-        <w:t xml:space="preserve">structural</w:t>
-      </w:r>
-      <w:r>
-        <w:t xml:space="preserve"> </w:t>
-      </w:r>
-      <w:r>
-        <w:t xml:space="preserve">patterns predicted by the Chapter 2 literature, and will be updated with the measured numbers once the runs complete. Every reported mean is paired with its three-seed standard deviation in the form</w:t>
-      </w:r>
-      <w:r>
-        <w:t xml:space="preserve"> </w:t>
-      </w:r>
-      <w:r>
-        <w:rPr>
-          <w:i/>
-          <w:iCs/>
-        </w:rPr>
-        <w:t xml:space="preserve">x ± y</w:t>
-      </w:r>
-      <w:r>
-        <w:t xml:space="preserve">.</w:t>
+        <w:t xml:space="preserve">, the corresponding CICIDS2017 experiment is queued but not yet reported; the discussion of those cells therefore remains an interpretation frame until the measured numbers are available. Unless otherwise stated, reported Lycos2017 AUROC values use the three pretraining seeds</w:t>
+      </w:r>
+      <w:r>
+        <w:t xml:space="preserve"> </w:t>
+      </w:r>
+      <m:oMath>
+        <m:r>
+          <m:rPr>
+            <m:sty m:val="p"/>
+          </m:rPr>
+          <m:t>{</m:t>
+        </m:r>
+        <m:r>
+          <m:t>42</m:t>
+        </m:r>
+        <m:r>
+          <m:rPr>
+            <m:sty m:val="p"/>
+          </m:rPr>
+          <m:t>,</m:t>
+        </m:r>
+        <m:r>
+          <m:t>43</m:t>
+        </m:r>
+        <m:r>
+          <m:rPr>
+            <m:sty m:val="p"/>
+          </m:rPr>
+          <m:t>,</m:t>
+        </m:r>
+        <m:r>
+          <m:t>44</m:t>
+        </m:r>
+        <m:r>
+          <m:rPr>
+            <m:sty m:val="p"/>
+          </m:rPr>
+          <m:t>}</m:t>
+        </m:r>
+      </m:oMath>
+      <w:r>
+        <w:t xml:space="preserve">, and reported few-shot macro-F1 values use three pretraining seeds × ten fine-tune sample seeds (</w:t>
+      </w:r>
+      <m:oMath>
+        <m:r>
+          <m:t>n</m:t>
+        </m:r>
+        <m:r>
+          <m:rPr>
+            <m:sty m:val="p"/>
+          </m:rPr>
+          <m:t>=</m:t>
+        </m:r>
+        <m:r>
+          <m:t>30</m:t>
+        </m:r>
+      </m:oMath>
+      <w:r>
+        <w:t xml:space="preserve">).</w:t>
       </w:r>
     </w:p>
     <w:bookmarkEnd w:id="89"/>
@@ -15322,7 +15351,7 @@
               <w:pStyle w:val="Compact"/>
             </w:pPr>
             <w:r>
-              <w:t xml:space="preserve">TBD</w:t>
+              <w:t xml:space="preserve">0.7416 ± 0.0756</w:t>
             </w:r>
           </w:p>
         </w:tc>
@@ -15344,7 +15373,7 @@
               <w:pStyle w:val="Compact"/>
             </w:pPr>
             <w:r>
-              <w:t xml:space="preserve">TBD</w:t>
+              <w:t xml:space="preserve">0.1739</w:t>
             </w:r>
           </w:p>
         </w:tc>
@@ -15368,7 +15397,7 @@
               <w:pStyle w:val="Compact"/>
             </w:pPr>
             <w:r>
-              <w:t xml:space="preserve">TBD</w:t>
+              <w:t xml:space="preserve">0.9947 ± 0.0024</w:t>
             </w:r>
           </w:p>
         </w:tc>
@@ -15390,7 +15419,7 @@
               <w:pStyle w:val="Compact"/>
             </w:pPr>
             <w:r>
-              <w:t xml:space="preserve">TBD</w:t>
+              <w:t xml:space="preserve">0.0019</w:t>
             </w:r>
           </w:p>
         </w:tc>
@@ -15414,7 +15443,7 @@
               <w:pStyle w:val="Compact"/>
             </w:pPr>
             <w:r>
-              <w:t xml:space="preserve">TBD</w:t>
+              <w:t xml:space="preserve">0.9347 ± 0.0093</w:t>
             </w:r>
           </w:p>
         </w:tc>
@@ -15436,7 +15465,7 @@
               <w:pStyle w:val="Compact"/>
             </w:pPr>
             <w:r>
-              <w:t xml:space="preserve">TBD</w:t>
+              <w:t xml:space="preserve">0.0030</w:t>
             </w:r>
           </w:p>
         </w:tc>
@@ -15460,7 +15489,7 @@
               <w:pStyle w:val="Compact"/>
             </w:pPr>
             <w:r>
-              <w:t xml:space="preserve">TBD</w:t>
+              <w:t xml:space="preserve">0.9856 ± 0.0175</w:t>
             </w:r>
           </w:p>
         </w:tc>
@@ -15482,7 +15511,7 @@
               <w:pStyle w:val="Compact"/>
             </w:pPr>
             <w:r>
-              <w:t xml:space="preserve">TBD</w:t>
+              <w:t xml:space="preserve">0.0077</w:t>
             </w:r>
           </w:p>
         </w:tc>
@@ -15506,7 +15535,7 @@
               <w:pStyle w:val="Compact"/>
             </w:pPr>
             <w:r>
-              <w:t xml:space="preserve">TBD</w:t>
+              <w:t xml:space="preserve">0.9817 ± 0.0048</w:t>
             </w:r>
           </w:p>
         </w:tc>
@@ -15528,7 +15557,7 @@
               <w:pStyle w:val="Compact"/>
             </w:pPr>
             <w:r>
-              <w:t xml:space="preserve">TBD</w:t>
+              <w:t xml:space="preserve">0.0101</w:t>
             </w:r>
           </w:p>
         </w:tc>
@@ -15552,7 +15581,7 @@
               <w:pStyle w:val="Compact"/>
             </w:pPr>
             <w:r>
-              <w:t xml:space="preserve">TBD</w:t>
+              <w:t xml:space="preserve">0.9896 ± 0.0020</w:t>
             </w:r>
           </w:p>
         </w:tc>
@@ -15574,7 +15603,7 @@
               <w:pStyle w:val="Compact"/>
             </w:pPr>
             <w:r>
-              <w:t xml:space="preserve">TBD</w:t>
+              <w:t xml:space="preserve">0.0029</w:t>
             </w:r>
           </w:p>
         </w:tc>
@@ -15598,7 +15627,7 @@
               <w:pStyle w:val="Compact"/>
             </w:pPr>
             <w:r>
-              <w:t xml:space="preserve">TBD</w:t>
+              <w:t xml:space="preserve">0.9857 ± 0.0237</w:t>
             </w:r>
           </w:p>
         </w:tc>
@@ -15620,7 +15649,7 @@
               <w:pStyle w:val="Compact"/>
             </w:pPr>
             <w:r>
-              <w:t xml:space="preserve">TBD</w:t>
+              <w:t xml:space="preserve">0.0415</w:t>
             </w:r>
           </w:p>
         </w:tc>
@@ -15644,7 +15673,7 @@
               <w:pStyle w:val="Compact"/>
             </w:pPr>
             <w:r>
-              <w:t xml:space="preserve">TBD</w:t>
+              <w:t xml:space="preserve">0.9981 ± 0.0012</w:t>
             </w:r>
           </w:p>
         </w:tc>
@@ -15666,7 +15695,7 @@
               <w:pStyle w:val="Compact"/>
             </w:pPr>
             <w:r>
-              <w:t xml:space="preserve">TBD</w:t>
+              <w:t xml:space="preserve">0.0088</w:t>
             </w:r>
           </w:p>
         </w:tc>
@@ -15690,7 +15719,7 @@
               <w:pStyle w:val="Compact"/>
             </w:pPr>
             <w:r>
-              <w:t xml:space="preserve">TBD</w:t>
+              <w:t xml:space="preserve">0.9536 ± 0.0382</w:t>
             </w:r>
           </w:p>
         </w:tc>
@@ -15712,7 +15741,7 @@
               <w:pStyle w:val="Compact"/>
             </w:pPr>
             <w:r>
-              <w:t xml:space="preserve">TBD</w:t>
+              <w:t xml:space="preserve">0.0027</w:t>
             </w:r>
           </w:p>
         </w:tc>
@@ -15736,7 +15765,7 @@
               <w:pStyle w:val="Compact"/>
             </w:pPr>
             <w:r>
-              <w:t xml:space="preserve">TBD</w:t>
+              <w:t xml:space="preserve">0.6803 ± 0.1100</w:t>
             </w:r>
           </w:p>
         </w:tc>
@@ -15758,7 +15787,7 @@
               <w:pStyle w:val="Compact"/>
             </w:pPr>
             <w:r>
-              <w:t xml:space="preserve">TBD</w:t>
+              <w:t xml:space="preserve">0.2275</w:t>
             </w:r>
           </w:p>
         </w:tc>
@@ -15782,7 +15811,7 @@
               <w:pStyle w:val="Compact"/>
             </w:pPr>
             <w:r>
-              <w:t xml:space="preserve">TBD</w:t>
+              <w:t xml:space="preserve">0.6787 ± 0.1513</w:t>
             </w:r>
           </w:p>
         </w:tc>
@@ -15804,7 +15833,7 @@
               <w:pStyle w:val="Compact"/>
             </w:pPr>
             <w:r>
-              <w:t xml:space="preserve">TBD</w:t>
+              <w:t xml:space="preserve">0.2847</w:t>
             </w:r>
           </w:p>
         </w:tc>
@@ -15828,7 +15857,7 @@
               <w:pStyle w:val="Compact"/>
             </w:pPr>
             <w:r>
-              <w:t xml:space="preserve">TBD</w:t>
+              <w:t xml:space="preserve">0.9951 ± 0.0060</w:t>
             </w:r>
           </w:p>
         </w:tc>
@@ -15850,7 +15879,7 @@
               <w:pStyle w:val="Compact"/>
             </w:pPr>
             <w:r>
-              <w:t xml:space="preserve">TBD</w:t>
+              <w:t xml:space="preserve">0.0025</w:t>
             </w:r>
           </w:p>
         </w:tc>
@@ -15874,7 +15903,7 @@
               <w:pStyle w:val="Compact"/>
             </w:pPr>
             <w:r>
-              <w:t xml:space="preserve">TBD</w:t>
+              <w:t xml:space="preserve">0.8123 ± 0.0230</w:t>
             </w:r>
           </w:p>
         </w:tc>
@@ -15896,7 +15925,7 @@
               <w:pStyle w:val="Compact"/>
             </w:pPr>
             <w:r>
-              <w:t xml:space="preserve">TBD</w:t>
+              <w:t xml:space="preserve">0.0849</w:t>
             </w:r>
           </w:p>
         </w:tc>
@@ -15928,7 +15957,7 @@
                 <w:b/>
                 <w:bCs/>
               </w:rPr>
-              <w:t xml:space="preserve">TBD</w:t>
+              <w:t xml:space="preserve">0.9024 ± 0.0281</w:t>
             </w:r>
           </w:p>
         </w:tc>
@@ -15958,7 +15987,7 @@
                 <w:b/>
                 <w:bCs/>
               </w:rPr>
-              <w:t xml:space="preserve">TBD</w:t>
+              <w:t xml:space="preserve">0.0562</w:t>
             </w:r>
           </w:p>
         </w:tc>
@@ -16101,6 +16130,50 @@
         <w:pStyle w:val="BodyText"/>
       </w:pPr>
       <w:r>
+        <w:t xml:space="preserve">The reproduced mean AUROC is therefore a borderline but acceptable reproduction under this criterion: the observed gap is 0.0562, while</w:t>
+      </w:r>
+      <w:r>
+        <w:t xml:space="preserve"> </w:t>
+      </w:r>
+      <m:oMath>
+        <m:r>
+          <m:t>2</m:t>
+        </m:r>
+        <m:sSub>
+          <m:e>
+            <m:r>
+              <m:t>σ</m:t>
+            </m:r>
+          </m:e>
+          <m:sub>
+            <m:r>
+              <m:rPr>
+                <m:nor/>
+                <m:sty m:val="p"/>
+              </m:rPr>
+              <m:t>seed</m:t>
+            </m:r>
+          </m:sub>
+        </m:sSub>
+        <m:r>
+          <m:rPr>
+            <m:sty m:val="p"/>
+          </m:rPr>
+          <m:t>=</m:t>
+        </m:r>
+        <m:r>
+          <m:t>0.0563</m:t>
+        </m:r>
+      </m:oMath>
+      <w:r>
+        <w:t xml:space="preserve">. The aggregate result should nevertheless be interpreted as lower than the original paper’s headline value rather than as an exact match. Most high-support denial-of-service and scan classes remain close to the paper values, but the Botnet and Web Attack classes are materially weaker. This pattern is consistent with the class distribution in the local Lycos2017 file: Botnet, Web Attack (XSS), Web Attack (SQL Injection), and Heartbleed have far fewer examples than the dominant benign, Portscan, DoS Hulk, and DDoS classes. The Lycos2017 result is therefore retained as a valid reproduction run, but the thesis does not claim to fully recover every class-level result reported by Wilkie et al. (2025).</w:t>
+      </w:r>
+    </w:p>
+    <w:p>
+      <w:pPr>
+        <w:pStyle w:val="BodyText"/>
+      </w:pPr>
+      <w:r>
         <w:t xml:space="preserve">Table 4.2 reports the corresponding 8- to 1024-shot macro-F1 curve for the Lycos2017 reproduction, averaged over three pretraining seeds and ten fine-tune sample seeds (</w:t>
       </w:r>
       <m:oMath>
@@ -16137,9 +16210,10 @@
         <w:tblLook w:firstRow="1" w:lastRow="0" w:firstColumn="0" w:lastColumn="0" w:noHBand="0" w:noVBand="0" w:val="0020"/>
       </w:tblPr>
       <w:tblGrid>
-        <w:gridCol w:w="2640"/>
-        <w:gridCol w:w="2640"/>
-        <w:gridCol w:w="2640"/>
+        <w:gridCol w:w="1980"/>
+        <w:gridCol w:w="1980"/>
+        <w:gridCol w:w="1980"/>
+        <w:gridCol w:w="1980"/>
       </w:tblGrid>
       <w:tr>
         <w:trPr>
@@ -16206,6 +16280,17 @@
             </w:r>
           </w:p>
         </w:tc>
+        <w:tc>
+          <w:tcPr/>
+          <w:p>
+            <w:pPr>
+              <w:pStyle w:val="Compact"/>
+            </w:pPr>
+            <w:r>
+              <w:t xml:space="preserve">Absolute gap</w:t>
+            </w:r>
+          </w:p>
+        </w:tc>
       </w:tr>
       <w:tr>
         <w:tc>
@@ -16226,7 +16311,7 @@
               <w:pStyle w:val="Compact"/>
             </w:pPr>
             <w:r>
-              <w:t xml:space="preserve">TBD</w:t>
+              <w:t xml:space="preserve">0.3488 ± 0.0379</w:t>
             </w:r>
           </w:p>
         </w:tc>
@@ -16238,6 +16323,17 @@
             </w:pPr>
             <w:r>
               <w:t xml:space="preserve">0.4963</w:t>
+            </w:r>
+          </w:p>
+        </w:tc>
+        <w:tc>
+          <w:tcPr/>
+          <w:p>
+            <w:pPr>
+              <w:pStyle w:val="Compact"/>
+            </w:pPr>
+            <w:r>
+              <w:t xml:space="preserve">0.1475</w:t>
             </w:r>
           </w:p>
         </w:tc>
@@ -16261,7 +16357,7 @@
               <w:pStyle w:val="Compact"/>
             </w:pPr>
             <w:r>
-              <w:t xml:space="preserve">TBD</w:t>
+              <w:t xml:space="preserve">0.4330 ± 0.0436</w:t>
             </w:r>
           </w:p>
         </w:tc>
@@ -16273,6 +16369,17 @@
             </w:pPr>
             <w:r>
               <w:t xml:space="preserve">0.5383</w:t>
+            </w:r>
+          </w:p>
+        </w:tc>
+        <w:tc>
+          <w:tcPr/>
+          <w:p>
+            <w:pPr>
+              <w:pStyle w:val="Compact"/>
+            </w:pPr>
+            <w:r>
+              <w:t xml:space="preserve">0.1053</w:t>
             </w:r>
           </w:p>
         </w:tc>
@@ -16296,7 +16403,7 @@
               <w:pStyle w:val="Compact"/>
             </w:pPr>
             <w:r>
-              <w:t xml:space="preserve">TBD</w:t>
+              <w:t xml:space="preserve">0.5054 ± 0.0375</w:t>
             </w:r>
           </w:p>
         </w:tc>
@@ -16308,6 +16415,17 @@
             </w:pPr>
             <w:r>
               <w:t xml:space="preserve">0.5450</w:t>
+            </w:r>
+          </w:p>
+        </w:tc>
+        <w:tc>
+          <w:tcPr/>
+          <w:p>
+            <w:pPr>
+              <w:pStyle w:val="Compact"/>
+            </w:pPr>
+            <w:r>
+              <w:t xml:space="preserve">0.0396</w:t>
             </w:r>
           </w:p>
         </w:tc>
@@ -16331,7 +16449,7 @@
               <w:pStyle w:val="Compact"/>
             </w:pPr>
             <w:r>
-              <w:t xml:space="preserve">TBD</w:t>
+              <w:t xml:space="preserve">0.5535 ± 0.0397</w:t>
             </w:r>
           </w:p>
         </w:tc>
@@ -16343,6 +16461,17 @@
             </w:pPr>
             <w:r>
               <w:t xml:space="preserve">0.5892</w:t>
+            </w:r>
+          </w:p>
+        </w:tc>
+        <w:tc>
+          <w:tcPr/>
+          <w:p>
+            <w:pPr>
+              <w:pStyle w:val="Compact"/>
+            </w:pPr>
+            <w:r>
+              <w:t xml:space="preserve">0.0357</w:t>
             </w:r>
           </w:p>
         </w:tc>
@@ -16366,7 +16495,7 @@
               <w:pStyle w:val="Compact"/>
             </w:pPr>
             <w:r>
-              <w:t xml:space="preserve">TBD</w:t>
+              <w:t xml:space="preserve">0.6121 ± 0.0292</w:t>
             </w:r>
           </w:p>
         </w:tc>
@@ -16378,6 +16507,17 @@
             </w:pPr>
             <w:r>
               <w:t xml:space="preserve">0.6288</w:t>
+            </w:r>
+          </w:p>
+        </w:tc>
+        <w:tc>
+          <w:tcPr/>
+          <w:p>
+            <w:pPr>
+              <w:pStyle w:val="Compact"/>
+            </w:pPr>
+            <w:r>
+              <w:t xml:space="preserve">0.0167</w:t>
             </w:r>
           </w:p>
         </w:tc>
@@ -16401,7 +16541,7 @@
               <w:pStyle w:val="Compact"/>
             </w:pPr>
             <w:r>
-              <w:t xml:space="preserve">TBD</w:t>
+              <w:t xml:space="preserve">0.6614 ± 0.0214</w:t>
             </w:r>
           </w:p>
         </w:tc>
@@ -16413,6 +16553,17 @@
             </w:pPr>
             <w:r>
               <w:t xml:space="preserve">0.6554</w:t>
+            </w:r>
+          </w:p>
+        </w:tc>
+        <w:tc>
+          <w:tcPr/>
+          <w:p>
+            <w:pPr>
+              <w:pStyle w:val="Compact"/>
+            </w:pPr>
+            <w:r>
+              <w:t xml:space="preserve">0.0060</w:t>
             </w:r>
           </w:p>
         </w:tc>
@@ -16436,7 +16587,7 @@
               <w:pStyle w:val="Compact"/>
             </w:pPr>
             <w:r>
-              <w:t xml:space="preserve">TBD</w:t>
+              <w:t xml:space="preserve">0.6927 ± 0.0378</w:t>
             </w:r>
           </w:p>
         </w:tc>
@@ -16448,6 +16599,17 @@
             </w:pPr>
             <w:r>
               <w:t xml:space="preserve">0.7102</w:t>
+            </w:r>
+          </w:p>
+        </w:tc>
+        <w:tc>
+          <w:tcPr/>
+          <w:p>
+            <w:pPr>
+              <w:pStyle w:val="Compact"/>
+            </w:pPr>
+            <w:r>
+              <w:t xml:space="preserve">0.0175</w:t>
             </w:r>
           </w:p>
         </w:tc>
@@ -16471,7 +16633,7 @@
               <w:pStyle w:val="Compact"/>
             </w:pPr>
             <w:r>
-              <w:t xml:space="preserve">TBD</w:t>
+              <w:t xml:space="preserve">0.7016 ± 0.0315</w:t>
             </w:r>
           </w:p>
         </w:tc>
@@ -16483,11 +16645,30 @@
             </w:pPr>
             <w:r>
               <w:t xml:space="preserve">0.7388</w:t>
+            </w:r>
+          </w:p>
+        </w:tc>
+        <w:tc>
+          <w:tcPr/>
+          <w:p>
+            <w:pPr>
+              <w:pStyle w:val="Compact"/>
+            </w:pPr>
+            <w:r>
+              <w:t xml:space="preserve">0.0372</w:t>
             </w:r>
           </w:p>
         </w:tc>
       </w:tr>
     </w:tbl>
+    <w:p>
+      <w:pPr>
+        <w:pStyle w:val="BodyText"/>
+      </w:pPr>
+      <w:r>
+        <w:t xml:space="preserve">The few-shot curve is monotonic and therefore supports the core claim that the pretrained encoder provides a representation that becomes increasingly useful as labelled support increases. However, the low-shot regime is weaker than Wilkie et al.’s (2025) report. The 8-shot macro-F1 gap is 0.1475, whereas the 256-shot value slightly exceeds the published CLAN value. The most conservative interpretation is that the training run captured the expected sample-efficiency trend but did not reproduce the paper’s low-shot headline strength. For this reason, the remaining experiments keep the Lycos2017 hyperparameters fixed rather than tuning specifically for Lycos2017: changing them after seeing the clean-corpus result would weaken the fairness of the subsequent CICIDS2017 comparison.</w:t>
+      </w:r>
+    </w:p>
     <w:bookmarkEnd w:id="90"/>
     <w:bookmarkStart w:id="91" w:name="clan-on-the-original-cicids2017-rq2"/>
     <w:p>
@@ -17166,7 +17347,7 @@
               <w:pStyle w:val="Compact"/>
             </w:pPr>
             <w:r>
-              <w:t xml:space="preserve">TBD</w:t>
+              <w:t xml:space="preserve">0.9024 ± 0.0281</w:t>
             </w:r>
           </w:p>
         </w:tc>
@@ -17223,7 +17404,7 @@
               <w:pStyle w:val="Compact"/>
             </w:pPr>
             <w:r>
-              <w:t xml:space="preserve">TBD</w:t>
+              <w:t xml:space="preserve">0.6787 (Web Attack XSS)</w:t>
             </w:r>
           </w:p>
         </w:tc>
@@ -17280,7 +17461,7 @@
               <w:pStyle w:val="Compact"/>
             </w:pPr>
             <w:r>
-              <w:t xml:space="preserve">TBD</w:t>
+              <w:t xml:space="preserve">0.0281</w:t>
             </w:r>
           </w:p>
         </w:tc>
@@ -17337,7 +17518,7 @@
               <w:pStyle w:val="Compact"/>
             </w:pPr>
             <w:r>
-              <w:t xml:space="preserve">TBD</w:t>
+              <w:t xml:space="preserve">0.3488 ± 0.0379</w:t>
             </w:r>
           </w:p>
         </w:tc>
@@ -17394,7 +17575,7 @@
               <w:pStyle w:val="Compact"/>
             </w:pPr>
             <w:r>
-              <w:t xml:space="preserve">TBD</w:t>
+              <w:t xml:space="preserve">0.7016 ± 0.0315</w:t>
             </w:r>
           </w:p>
         </w:tc>
@@ -17621,7 +17802,7 @@
               <w:pStyle w:val="Compact"/>
             </w:pPr>
             <w:r>
-              <w:t xml:space="preserve">TBD</w:t>
+              <w:t xml:space="preserve">9</w:t>
             </w:r>
           </w:p>
         </w:tc>
@@ -17667,7 +17848,7 @@
               <w:pStyle w:val="Compact"/>
             </w:pPr>
             <w:r>
-              <w:t xml:space="preserve">TBD</w:t>
+              <w:t xml:space="preserve">2</w:t>
             </w:r>
           </w:p>
         </w:tc>
@@ -17713,7 +17894,7 @@
               <w:pStyle w:val="Compact"/>
             </w:pPr>
             <w:r>
-              <w:t xml:space="preserve">TBD</w:t>
+              <w:t xml:space="preserve">8</w:t>
             </w:r>
           </w:p>
         </w:tc>
@@ -17759,7 +17940,7 @@
               <w:pStyle w:val="Compact"/>
             </w:pPr>
             <w:r>
-              <w:t xml:space="preserve">TBD</w:t>
+              <w:t xml:space="preserve">5</w:t>
             </w:r>
           </w:p>
         </w:tc>
@@ -17805,7 +17986,7 @@
               <w:pStyle w:val="Compact"/>
             </w:pPr>
             <w:r>
-              <w:t xml:space="preserve">TBD</w:t>
+              <w:t xml:space="preserve">6</w:t>
             </w:r>
           </w:p>
         </w:tc>
@@ -17851,7 +18032,7 @@
               <w:pStyle w:val="Compact"/>
             </w:pPr>
             <w:r>
-              <w:t xml:space="preserve">TBD</w:t>
+              <w:t xml:space="preserve">3</w:t>
             </w:r>
           </w:p>
         </w:tc>
@@ -17897,7 +18078,7 @@
               <w:pStyle w:val="Compact"/>
             </w:pPr>
             <w:r>
-              <w:t xml:space="preserve">TBD</w:t>
+              <w:t xml:space="preserve">4</w:t>
             </w:r>
           </w:p>
         </w:tc>
@@ -17943,7 +18124,7 @@
               <w:pStyle w:val="Compact"/>
             </w:pPr>
             <w:r>
-              <w:t xml:space="preserve">TBD</w:t>
+              <w:t xml:space="preserve">1</w:t>
             </w:r>
           </w:p>
         </w:tc>
@@ -17989,7 +18170,7 @@
               <w:pStyle w:val="Compact"/>
             </w:pPr>
             <w:r>
-              <w:t xml:space="preserve">TBD</w:t>
+              <w:t xml:space="preserve">7</w:t>
             </w:r>
           </w:p>
         </w:tc>
@@ -18035,7 +18216,7 @@
               <w:pStyle w:val="Compact"/>
             </w:pPr>
             <w:r>
-              <w:t xml:space="preserve">TBD</w:t>
+              <w:t xml:space="preserve">10</w:t>
             </w:r>
           </w:p>
         </w:tc>
@@ -18081,7 +18262,7 @@
               <w:pStyle w:val="Compact"/>
             </w:pPr>
             <w:r>
-              <w:t xml:space="preserve">TBD</w:t>
+              <w:t xml:space="preserve">11</w:t>
             </w:r>
           </w:p>
         </w:tc>
@@ -18508,7 +18689,7 @@
               <w:pStyle w:val="Compact"/>
             </w:pPr>
             <w:r>
-              <w:t xml:space="preserve">TBD</w:t>
+              <w:t xml:space="preserve">0.3488 ± 0.0379</w:t>
             </w:r>
           </w:p>
         </w:tc>
@@ -18565,7 +18746,7 @@
               <w:pStyle w:val="Compact"/>
             </w:pPr>
             <w:r>
-              <w:t xml:space="preserve">TBD</w:t>
+              <w:t xml:space="preserve">0.4330 ± 0.0436</w:t>
             </w:r>
           </w:p>
         </w:tc>
@@ -18622,7 +18803,7 @@
               <w:pStyle w:val="Compact"/>
             </w:pPr>
             <w:r>
-              <w:t xml:space="preserve">TBD</w:t>
+              <w:t xml:space="preserve">0.5054 ± 0.0375</w:t>
             </w:r>
           </w:p>
         </w:tc>
@@ -18679,7 +18860,7 @@
               <w:pStyle w:val="Compact"/>
             </w:pPr>
             <w:r>
-              <w:t xml:space="preserve">TBD</w:t>
+              <w:t xml:space="preserve">0.5535 ± 0.0397</w:t>
             </w:r>
           </w:p>
         </w:tc>
@@ -18736,7 +18917,7 @@
               <w:pStyle w:val="Compact"/>
             </w:pPr>
             <w:r>
-              <w:t xml:space="preserve">TBD</w:t>
+              <w:t xml:space="preserve">0.6121 ± 0.0292</w:t>
             </w:r>
           </w:p>
         </w:tc>
@@ -18793,7 +18974,7 @@
               <w:pStyle w:val="Compact"/>
             </w:pPr>
             <w:r>
-              <w:t xml:space="preserve">TBD</w:t>
+              <w:t xml:space="preserve">0.6614 ± 0.0214</w:t>
             </w:r>
           </w:p>
         </w:tc>
@@ -18850,7 +19031,7 @@
               <w:pStyle w:val="Compact"/>
             </w:pPr>
             <w:r>
-              <w:t xml:space="preserve">TBD</w:t>
+              <w:t xml:space="preserve">0.6927 ± 0.0378</w:t>
             </w:r>
           </w:p>
         </w:tc>
@@ -18907,7 +19088,7 @@
               <w:pStyle w:val="Compact"/>
             </w:pPr>
             <w:r>
-              <w:t xml:space="preserve">TBD</w:t>
+              <w:t xml:space="preserve">0.7016 ± 0.0315</w:t>
             </w:r>
           </w:p>
         </w:tc>
@@ -19059,7 +19240,7 @@
         <w:pStyle w:val="FirstParagraph"/>
       </w:pPr>
       <w:r>
-        <w:t xml:space="preserve">If the reproduced numbers in Tables 4.1 and 4.2 track Wilkie et al.’s (2025) values within a</w:t>
+        <w:t xml:space="preserve">The reproduced Lycos2017 results give a mixed answer to RQ1. At the aggregate anomaly-detection level, the mean AUROC of 0.9024 ± 0.0281 is only marginally inside the pre-declared</w:t>
       </w:r>
       <w:r>
         <w:t xml:space="preserve"> </w:t>
@@ -19095,22 +19276,15 @@
         <w:t xml:space="preserve"> </w:t>
       </w:r>
       <w:r>
-        <w:t xml:space="preserve">envelope, the present study establishes the first externally-published confirmation of the CLAN headline claim on Lycos2017. If the reproduced numbers deviate materially, the discussion will consider three candidate explanations: (a) minor deterministic-training discrepancies between the present PyTorch 2.5 runs and the upstream PyTorch 2.0 runs, (b) the randomness introduced by the</w:t>
-      </w:r>
-      <w:r>
-        <w:t xml:space="preserve"> </w:t>
-      </w:r>
-      <w:r>
-        <w:rPr>
-          <w:rStyle w:val="VerbatimChar"/>
-        </w:rPr>
-        <w:t xml:space="preserve">WeightedRandomSampler</w:t>
-      </w:r>
-      <w:r>
-        <w:t xml:space="preserve"> </w:t>
-      </w:r>
-      <w:r>
-        <w:t xml:space="preserve">despite the fixed seed, and (c) any residual difference between the LycoSTand-produced Lycos2017 snapshot the present study downloads and the one used by the original authors. Each of these is a well-recognised source of reproduction noise in the broader SSL literature (Chen et al., 2020; Grill et al., 2020) and would not materially weaken the CLAN claim.</w:t>
+        <w:t xml:space="preserve">envelope around Wilkie et al.’s (2025) 0.9586 headline value. This supports retaining the run as a valid reproduction attempt, but it does not justify claiming an exact recovery of the original paper’s performance. At the few-shot level, the discrepancy is clearer: the 8-shot macro-F1 is 0.3488 ± 0.0379 compared with Wilkie et al.’s 0.4963. The gap narrows at higher shot counts and becomes negligible at 256 shots, which suggests that the representation is useful but less sample-efficient in the lowest-support regime than the published result.</w:t>
+      </w:r>
+    </w:p>
+    <w:p>
+      <w:pPr>
+        <w:pStyle w:val="BodyText"/>
+      </w:pPr>
+      <w:r>
+        <w:t xml:space="preserve">Three explanations are plausible and non-exclusive. First, deterministic-training differences remain possible between the present PyTorch 2.5 runs on a Windows RTX 3060 Laptop GPU and the upstream PyTorch 2.0 environment. Second, the fine-tune stage samples only a few labelled flows per class, and the weakest classes in Table 4.1 are precisely the low-support Web Attack and Botnet classes. Third, the local Lycos2017 snapshot may not be byte-identical to the one used by Wilkie et al. (2025). These factors are recognised sources of reproduction variation in SSL experiments (Chen et al., 2020; Grill et al., 2020). The thesis therefore treats the Lycos2017 result as a completed and reportable reproduction, while making the performance gap explicit rather than tuning the hyperparameters after observing it.</w:t>
       </w:r>
     </w:p>
     <w:p>
@@ -19910,18 +20084,12 @@
         <w:t xml:space="preserve"> </w:t>
       </w:r>
       <w:r>
-        <w:t xml:space="preserve">envelope? The evidence lives in Table 4.1 (per-class and mean AUROC) and Table 4.2 (few-shot macro-F1 curve). A positive answer requires the reproduced mean AUROC to fall within</w:t>
+        <w:t xml:space="preserve">envelope? The answer is partial. The reproduced mean AUROC is 0.9024 ± 0.0281, giving an absolute gap of 0.0562 against the paper’s reported 0.9586; this is narrowly inside the pre-declared</w:t>
       </w:r>
       <w:r>
         <w:t xml:space="preserve"> </w:t>
       </w:r>
       <m:oMath>
-        <m:r>
-          <m:rPr>
-            <m:sty m:val="p"/>
-          </m:rPr>
-          <m:t>±</m:t>
-        </m:r>
         <m:r>
           <m:t>2</m:t>
         </m:r>
@@ -19946,7 +20114,7 @@
         <w:t xml:space="preserve"> </w:t>
       </w:r>
       <w:r>
-        <w:t xml:space="preserve">of the paper’s reported 0.9586, and the reproduced 8-shot macro-F1 to fall within the same envelope around 0.4963. Independently of the numeric outcome, the two paper-versus-code discrepancies uncovered during the port (§3.11.1, §4.6.1) are themselves standalone contributions to the reproducibility of the CLAN method.</w:t>
+        <w:t xml:space="preserve">envelope of 0.0563. The few-shot result is less close: the reproduced 8-shot macro-F1 is 0.3488 ± 0.0379 against Wilkie et al.’s 0.4963. The evidence therefore supports the correctness and usefulness of the implemented CLAN pipeline, but not a claim of exact headline-performance recovery. Independently of the numeric outcome, the two paper-versus-code discrepancies uncovered during the port (§3.11.1, §4.6.1) are themselves standalone contributions to the reproducibility of the CLAN method.</w:t>
       </w:r>
     </w:p>
     <w:p>
@@ -20361,7 +20529,7 @@
         <w:rPr>
           <w:rStyle w:val="VerbatimChar"/>
         </w:rPr>
-        <w:t xml:space="preserve">scripts/run_experiment.sh</w:t>
+        <w:t xml:space="preserve">scripts/run_experiment.py</w:t>
       </w:r>
       <w:r>
         <w:t xml:space="preserve"> </w:t>

</xml_diff>